<commit_message>
Cut the plain-English script to two paragraphs per video
Four pages of beats was still a script to read from. Two paragraphs each fits on
one page and is short enough to say from memory.

Co-Authored-By: Claude Opus 5 (1M context) <noreply@anthropic.com>
</commit_message>
<xml_diff>
--- a/LOOM-SCRIPTS-PLAIN.docx
+++ b/LOOM-SCRIPTS-PLAIN.docx
@@ -16,16 +16,8 @@
           <w:b w:val="0"/>
           <w:i w:val="0"/>
         </w:rPr>
-        <w:t>No timings. Just say these things in order, in your own words.</w:t>
+        <w:t>Two paragraphs each. Say them in your own words.</w:t>
       </w:r>
-    </w:p>
-    <w:p>
-      <w:pPr>
-        <w:spacing w:before="40" w:after="160"/>
-        <w:pBdr>
-          <w:bottom w:val="single" w:sz="6" w:space="6" w:color="D8D8D8"/>
-        </w:pBdr>
-      </w:pPr>
     </w:p>
     <w:p>
       <w:pPr>
@@ -36,11 +28,12 @@
       </w:r>
     </w:p>
     <w:p>
-      <w:pPr>
-        <w:pStyle w:val="Heading3"/>
-      </w:pPr>
       <w:r>
-        <w:t>Start with what it is</w:t>
+        <w:rPr>
+          <w:b w:val="0"/>
+          <w:i w:val="0"/>
+        </w:rPr>
+        <w:t>I built a fake patient that phones your AI receptionist and holds real conversations with it. Twelve different patients, each calling about something different — booking an appointment, a prescription refill, someone who can't say what's wrong. Think of me as a switchboard operator sitting in the middle. Twilio is the phone company: I tell it to dial your number, and when your AI picks up, instead of connecting a human it pipes the live audio to my computer. My computer hands that audio straight to OpenAI, which does the talking as the patient, then hands OpenAI's voice back down the line to you. The lucky part is the phone company and OpenAI happen to use the same audio format, so I never convert anything — I just copy the sound across untouched. That's why there's so little code.</w:t>
       </w:r>
     </w:p>
     <w:p>
@@ -49,258 +42,8 @@
           <w:b w:val="0"/>
           <w:i w:val="0"/>
         </w:rPr>
-        <w:t>I built a fake patient that phones your AI receptionist and has real conversations with it. Twelve different patients, each one calling about something different — one wants an appointment, one wants a prescription refill, one is confused and can't say what's wrong. It records both sides of every call and writes up what went wrong.</w:t>
+        <w:t>I could have chained three separate tools together instead — one to turn speech into text, one to think, one to turn text back into speech — but that's like translating through three people standing in a line, and every handoff adds a delay. Your AI is already slow to answer, and two slow things talking means long awkward pauses, which is exactly what you mark people down for. I also skipped the ready-made frameworks, because the plumbing is the interesting part and a framework hides it. What I found: your AI has two ways of checking who's calling. The short way recognises the phone number, asks a date of birth, and works — people got appointments booked and moved. The long way asks for a name, a spelling, then a phone number, and every single time it goes that route the call dies: it confirms all your details out loud, says "I can't proceed further," and transfers you to a line that immediately says goodbye. Twelve of eighteen calls went the long way and not one got what they called for. Same caller, same details — the only difference was the route.</w:t>
       </w:r>
-    </w:p>
-    <w:p>
-      <w:pPr>
-        <w:pStyle w:val="Heading3"/>
-      </w:pPr>
-      <w:r>
-        <w:t>How it works</w:t>
-      </w:r>
-    </w:p>
-    <w:p>
-      <w:r>
-        <w:rPr>
-          <w:b w:val="0"/>
-          <w:i w:val="0"/>
-        </w:rPr>
-        <w:t>Think of me as a switchboard operator sitting in the middle of the call.</w:t>
-      </w:r>
-    </w:p>
-    <w:p>
-      <w:r>
-        <w:rPr>
-          <w:b w:val="0"/>
-          <w:i w:val="0"/>
-        </w:rPr>
-        <w:t>Twilio is the phone company. I tell it to dial your number. When your AI picks up, Twilio doesn't connect it to a human — it pipes the live audio to my computer instead. My computer hands that audio straight to OpenAI, which is doing the talking as the patient. Then it hands OpenAI's voice back down the phone line to you.</w:t>
-      </w:r>
-    </w:p>
-    <w:p>
-      <w:r>
-        <w:rPr>
-          <w:b w:val="0"/>
-          <w:i w:val="0"/>
-        </w:rPr>
-        <w:t>That's the whole thing. Audio in one ear, out the other.</w:t>
-      </w:r>
-    </w:p>
-    <w:p>
-      <w:r>
-        <w:rPr>
-          <w:b w:val="0"/>
-          <w:i w:val="0"/>
-        </w:rPr>
-        <w:t>The lucky part is that the phone company and OpenAI happen to use the exact same audio format. So I never convert anything — I just copy the sound across untouched. That's why there's so little code.</w:t>
-      </w:r>
-    </w:p>
-    <w:p>
-      <w:pPr>
-        <w:pStyle w:val="Heading3"/>
-      </w:pPr>
-      <w:r>
-        <w:t>Why I built it that way, and not the other ways</w:t>
-      </w:r>
-    </w:p>
-    <w:p>
-      <w:r>
-        <w:rPr>
-          <w:b/>
-          <w:i w:val="0"/>
-        </w:rPr>
-        <w:t>I could have chained three separate tools together</w:t>
-      </w:r>
-      <w:r>
-        <w:rPr>
-          <w:b w:val="0"/>
-          <w:i w:val="0"/>
-        </w:rPr>
-        <w:t xml:space="preserve"> — one to turn speech into text, one to think about it, one to turn text back into speech. That's like translating a conversation through three people standing in a line. Every handoff adds a delay. Your AI is already slow to answer. Two slow things talking to each other means long awkward pauses, and awkward pauses are exactly what you grade people down for. So I didn't.</w:t>
-      </w:r>
-    </w:p>
-    <w:p>
-      <w:r>
-        <w:rPr>
-          <w:b/>
-          <w:i w:val="0"/>
-        </w:rPr>
-        <w:t>I could have used a ready-made framework</w:t>
-      </w:r>
-      <w:r>
-        <w:rPr>
-          <w:b w:val="0"/>
-          <w:i w:val="0"/>
-        </w:rPr>
-        <w:t xml:space="preserve"> that handles the phone plumbing for me. I didn't, because the plumbing is the interesting part — knowing when to stop talking, when to butt in, when to hang up. If a framework does all that, I can't explain any of it to you.</w:t>
-      </w:r>
-    </w:p>
-    <w:p>
-      <w:r>
-        <w:rPr>
-          <w:b/>
-          <w:i w:val="0"/>
-        </w:rPr>
-        <w:t>I could have used a service where you type a prompt and it makes the call for you.</w:t>
-      </w:r>
-      <w:r>
-        <w:rPr>
-          <w:b w:val="0"/>
-          <w:i w:val="0"/>
-        </w:rPr>
-        <w:t xml:space="preserve"> Thirty lines of code, done in an hour. I didn't, because then the service makes every decision that matters and I'd have nothing to tell you.</w:t>
-      </w:r>
-    </w:p>
-    <w:p>
-      <w:pPr>
-        <w:pStyle w:val="Heading3"/>
-      </w:pPr>
-      <w:r>
-        <w:t>How I tested it without a huge phone bill</w:t>
-      </w:r>
-    </w:p>
-    <w:p>
-      <w:r>
-        <w:rPr>
-          <w:b w:val="0"/>
-          <w:i w:val="0"/>
-        </w:rPr>
-        <w:t>Phone calls cost money and take two minutes each. So before calling you at all, I had two AIs talk to each other on my laptop with no phone involved — one playing my patient, one playing a receptionist I made up. Exact same code, no phone company, no bill.</w:t>
-      </w:r>
-    </w:p>
-    <w:p>
-      <w:r>
-        <w:rPr>
-          <w:b w:val="0"/>
-          <w:i w:val="0"/>
-        </w:rPr>
-        <w:t>That caught four of my six bugs for pennies. My favourite one: my program went completely silent and nothing worked at all. It turns out a real phone line is never actually silent — it's constantly sending "nothing" down the wire. The AI listens for that "nothing" to know you've stopped talking. I wasn't sending it, so the AI thought the other person had never finished their sentence, and just sat there waiting forever.</w:t>
-      </w:r>
-    </w:p>
-    <w:p>
-      <w:pPr>
-        <w:pStyle w:val="Heading3"/>
-      </w:pPr>
-      <w:r>
-        <w:t>What I found</w:t>
-      </w:r>
-    </w:p>
-    <w:p>
-      <w:r>
-        <w:rPr>
-          <w:b w:val="0"/>
-          <w:i w:val="0"/>
-        </w:rPr>
-        <w:t>Your AI has two different ways of checking who's calling.</w:t>
-      </w:r>
-    </w:p>
-    <w:p>
-      <w:r>
-        <w:rPr>
-          <w:b/>
-          <w:i w:val="0"/>
-        </w:rPr>
-        <w:t>The short way:</w:t>
-      </w:r>
-      <w:r>
-        <w:rPr>
-          <w:b w:val="0"/>
-          <w:i w:val="0"/>
-        </w:rPr>
-        <w:t xml:space="preserve"> it recognises your phone number, asks your date of birth, done. This works. People got appointments booked, appointments moved, questions answered.</w:t>
-      </w:r>
-    </w:p>
-    <w:p>
-      <w:r>
-        <w:rPr>
-          <w:b/>
-          <w:i w:val="0"/>
-        </w:rPr>
-        <w:t>The long way:</w:t>
-      </w:r>
-      <w:r>
-        <w:rPr>
-          <w:b w:val="0"/>
-          <w:i w:val="0"/>
-        </w:rPr>
-        <w:t xml:space="preserve"> it asks your name, then asks you to spell it, then asks for your phone number, then reads it back to you. Every single time it goes down this route, the call dies. It confirms all your details out loud, then says "I can't proceed further right now," and transfers you to a line that immediately says goodbye.</w:t>
-      </w:r>
-    </w:p>
-    <w:p>
-      <w:r>
-        <w:rPr>
-          <w:b w:val="0"/>
-          <w:i w:val="0"/>
-        </w:rPr>
-        <w:t xml:space="preserve">Twelve of my eighteen calls went the long way. </w:t>
-      </w:r>
-      <w:r>
-        <w:rPr>
-          <w:b/>
-          <w:i w:val="0"/>
-        </w:rPr>
-        <w:t>None of them got what they called for.</w:t>
-      </w:r>
-      <w:r>
-        <w:rPr>
-          <w:b w:val="0"/>
-          <w:i w:val="0"/>
-        </w:rPr>
-        <w:t xml:space="preserve"> Six went the short way, and five of those got exactly what they wanted.</w:t>
-      </w:r>
-    </w:p>
-    <w:p>
-      <w:r>
-        <w:rPr>
-          <w:b w:val="0"/>
-          <w:i w:val="0"/>
-        </w:rPr>
-        <w:t>Same caller. Same details. Same information confirmed out loud. The only difference was which route your AI happened to take.</w:t>
-      </w:r>
-    </w:p>
-    <w:p>
-      <w:r>
-        <w:rPr>
-          <w:b w:val="0"/>
-          <w:i w:val="0"/>
-        </w:rPr>
-        <w:t>A few smaller things: it offered someone a slot two days away and called it "next week." It said the same sentence twice in a row on one call. It asked one caller their date of birth four separate times in the same conversation.</w:t>
-      </w:r>
-    </w:p>
-    <w:p>
-      <w:r>
-        <w:rPr>
-          <w:b w:val="0"/>
-          <w:i w:val="0"/>
-        </w:rPr>
-        <w:t>And credit where it's due — when one caller insisted she had a Friday appointment, it checked, told her honestly that she didn't, and refused to cancel anything. It didn't make something up to please her. That's the best behaviour I saw.</w:t>
-      </w:r>
-    </w:p>
-    <w:p>
-      <w:pPr>
-        <w:pStyle w:val="Heading3"/>
-      </w:pPr>
-      <w:r>
-        <w:t>Finish</w:t>
-      </w:r>
-    </w:p>
-    <w:p>
-      <w:r>
-        <w:rPr>
-          <w:b w:val="0"/>
-          <w:i w:val="0"/>
-        </w:rPr>
-        <w:t>Eighteen recordings and eighteen transcripts are all in the repo, including the part where I got the report wrong the first time.</w:t>
-      </w:r>
-    </w:p>
-    <w:p>
-      <w:pPr>
-        <w:spacing w:before="40" w:after="160"/>
-        <w:pBdr>
-          <w:bottom w:val="single" w:sz="6" w:space="6" w:color="D8D8D8"/>
-        </w:pBdr>
-      </w:pPr>
     </w:p>
     <w:p>
       <w:pPr>
@@ -316,15 +59,7 @@
           <w:b w:val="0"/>
           <w:i w:val="0"/>
         </w:rPr>
-        <w:t>You want to see how I actually work through a problem. So here's one bug, start to finish, including the two times I was wrong.</w:t>
-      </w:r>
-    </w:p>
-    <w:p>
-      <w:pPr>
-        <w:pStyle w:val="Heading3"/>
-      </w:pPr>
-      <w:r>
-        <w:t>The problem</w:t>
+        <w:t>My first real phone call lasted one second, and my program didn't write down a thing. So instead of guessing I asked for the actual error, and it said Twilio connected to my server and then my server hung up — which blamed my code. I didn't accept that. I asked it to connect to my server the same way Twilio does and tell me whether it actually worked, and it worked fine. So the message was technically true but pointing at the wrong thing: my server did hang up, deliberately, and nothing was recording why. I'd been theorising about three different causes and couldn't prove any of them, so I stopped guessing and said: my program can reject a call in three places and all three are silent, make each one say why. One line of logging, and the next call told me immediately — it never knew which patient to play, because I'd attached that information to the end of the web address like a link with a question mark in it, and Twilio throws that part away.</w:t>
       </w:r>
     </w:p>
     <w:p>
@@ -333,380 +68,7 @@
           <w:b w:val="0"/>
           <w:i w:val="0"/>
         </w:rPr>
-        <w:t>I placed my first real phone call. Twilio reported the call finished normally. It lasted one second. My program didn't write down a single thing.</w:t>
-      </w:r>
-    </w:p>
-    <w:p>
-      <w:pPr>
-        <w:pStyle w:val="Heading3"/>
-      </w:pPr>
-      <w:r>
-        <w:t>First move: get the facts, don't guess</w:t>
-      </w:r>
-    </w:p>
-    <w:p>
-      <w:r>
-        <w:rPr>
-          <w:b w:val="0"/>
-          <w:i w:val="0"/>
-        </w:rPr>
-        <w:t>I asked for the real error instead of theorising:</w:t>
-      </w:r>
-    </w:p>
-    <w:p>
-      <w:pPr>
-        <w:spacing w:before="80" w:after="80"/>
-        <w:ind w:left="403"/>
-        <w:pBdr>
-          <w:left w:val="single" w:sz="12" w:space="6" w:color="C8C8C8"/>
-        </w:pBdr>
-      </w:pPr>
-      <w:r>
-        <w:rPr>
-          <w:b w:val="0"/>
-          <w:i/>
-          <w:color w:val="5A5A5A"/>
-        </w:rPr>
-        <w:t>"The call ended after one second and my program logged nothing. Go pull the Twilio error for that call and tell me what it actually means."</w:t>
-      </w:r>
-    </w:p>
-    <w:p>
-      <w:r>
-        <w:rPr>
-          <w:b w:val="0"/>
-          <w:i w:val="0"/>
-        </w:rPr>
-        <w:t>The error said: Twilio connected to your server, and then your server hung up on it.</w:t>
-      </w:r>
-    </w:p>
-    <w:p>
-      <w:r>
-        <w:rPr>
-          <w:b w:val="0"/>
-          <w:i w:val="0"/>
-        </w:rPr>
-        <w:t>So it blamed my code. That framing is what cost me the most time.</w:t>
-      </w:r>
-    </w:p>
-    <w:p>
-      <w:pPr>
-        <w:pStyle w:val="Heading3"/>
-      </w:pPr>
-      <w:r>
-        <w:t>Second move: check whether the accusation is even true</w:t>
-      </w:r>
-    </w:p>
-    <w:p>
-      <w:pPr>
-        <w:spacing w:before="80" w:after="80"/>
-        <w:ind w:left="403"/>
-        <w:pBdr>
-          <w:left w:val="single" w:sz="12" w:space="6" w:color="C8C8C8"/>
-        </w:pBdr>
-      </w:pPr>
-      <w:r>
-        <w:rPr>
-          <w:b w:val="0"/>
-          <w:i/>
-          <w:color w:val="5A5A5A"/>
-        </w:rPr>
-        <w:t>"Before we change anything — connect to my server the same way Twilio does and tell me whether it actually works."</w:t>
-      </w:r>
-    </w:p>
-    <w:p>
-      <w:r>
-        <w:rPr>
-          <w:b w:val="0"/>
-          <w:i w:val="0"/>
-        </w:rPr>
-        <w:t xml:space="preserve">It worked perfectly. So the error was pointing at the wrong thing. It was technically true — my server </w:t>
-      </w:r>
-      <w:r>
-        <w:rPr>
-          <w:b w:val="0"/>
-          <w:i/>
-        </w:rPr>
-        <w:t>did</w:t>
-      </w:r>
-      <w:r>
-        <w:rPr>
-          <w:b w:val="0"/>
-          <w:i w:val="0"/>
-        </w:rPr>
-        <w:t xml:space="preserve"> hang up — but it hung up deliberately, and nothing was recording why.</w:t>
-      </w:r>
-    </w:p>
-    <w:p>
-      <w:pPr>
-        <w:pStyle w:val="Heading3"/>
-      </w:pPr>
-      <w:r>
-        <w:t>Third move: stop guessing, make it tell me</w:t>
-      </w:r>
-    </w:p>
-    <w:p>
-      <w:r>
-        <w:rPr>
-          <w:b w:val="0"/>
-          <w:i w:val="0"/>
-        </w:rPr>
-        <w:t>I'd been theorising about three different causes and couldn't prove any of them.</w:t>
-      </w:r>
-    </w:p>
-    <w:p>
-      <w:pPr>
-        <w:spacing w:before="80" w:after="80"/>
-        <w:ind w:left="403"/>
-        <w:pBdr>
-          <w:left w:val="single" w:sz="12" w:space="6" w:color="C8C8C8"/>
-        </w:pBdr>
-      </w:pPr>
-      <w:r>
-        <w:rPr>
-          <w:b w:val="0"/>
-          <w:i/>
-          <w:color w:val="5A5A5A"/>
-        </w:rPr>
-        <w:t>"I'm guessing here. My program can reject a call in three different places and all three are silent about it. Make each one say why, then I'll call again."</w:t>
-      </w:r>
-    </w:p>
-    <w:p>
-      <w:r>
-        <w:rPr>
-          <w:b w:val="0"/>
-          <w:i w:val="0"/>
-        </w:rPr>
-        <w:t>One line of logging. The next call printed the answer straight away: it didn't know which patient to play. I'd been attaching that information to the end of the web address, like a link with a question mark in it. Twilio throws that part away. You have to attach it a different way entirely.</w:t>
-      </w:r>
-    </w:p>
-    <w:p>
-      <w:pPr>
-        <w:pStyle w:val="Heading3"/>
-      </w:pPr>
-      <w:r>
-        <w:t>Fourth move: fix the thing that should have caught it</w:t>
-      </w:r>
-    </w:p>
-    <w:p>
-      <w:r>
-        <w:rPr>
-          <w:b w:val="0"/>
-          <w:i w:val="0"/>
-        </w:rPr>
-        <w:t>Here's the part I'd want to see if I were hiring someone.</w:t>
-      </w:r>
-    </w:p>
-    <w:p>
-      <w:r>
-        <w:rPr>
-          <w:b w:val="0"/>
-          <w:i w:val="0"/>
-        </w:rPr>
-        <w:t>My own test rig had the exact same mistake in it. It was attaching the information the same wrong way — so it agreed with me instead of testing me. That's why it passed while the real thing failed.</w:t>
-      </w:r>
-    </w:p>
-    <w:p>
-      <w:pPr>
-        <w:spacing w:before="80" w:after="80"/>
-        <w:ind w:left="403"/>
-        <w:pBdr>
-          <w:left w:val="single" w:sz="12" w:space="6" w:color="C8C8C8"/>
-        </w:pBdr>
-      </w:pPr>
-      <w:r>
-        <w:rPr>
-          <w:b w:val="0"/>
-          <w:i/>
-          <w:color w:val="5A5A5A"/>
-        </w:rPr>
-        <w:t>"Change the test rig to do it the way Twilio actually does, and add a check that fails if anyone ever goes back to the old way."</w:t>
-      </w:r>
-    </w:p>
-    <w:p>
-      <w:pPr>
-        <w:pStyle w:val="Heading3"/>
-      </w:pPr>
-      <w:r>
-        <w:t>Fifth move: point the same question at my own conclusions</w:t>
-      </w:r>
-    </w:p>
-    <w:p>
-      <w:r>
-        <w:rPr>
-          <w:b w:val="0"/>
-          <w:i w:val="0"/>
-        </w:rPr>
-        <w:t>I'd already finished the bug report. Eight problems, two of them marked critical. Then I asked the same question I'd asked about Twilio's error — what if the framing is wrong?</w:t>
-      </w:r>
-    </w:p>
-    <w:p>
-      <w:pPr>
-        <w:spacing w:before="80" w:after="80"/>
-        <w:ind w:left="403"/>
-        <w:pBdr>
-          <w:left w:val="single" w:sz="12" w:space="6" w:color="C8C8C8"/>
-        </w:pBdr>
-      </w:pPr>
-      <w:r>
-        <w:rPr>
-          <w:b w:val="0"/>
-          <w:i/>
-          <w:color w:val="5A5A5A"/>
-        </w:rPr>
-        <w:t>"Re-read all the transcripts and tell me whether my critical findings could just be artifacts of how I set up the test."</w:t>
-      </w:r>
-    </w:p>
-    <w:p>
-      <w:r>
-        <w:rPr>
-          <w:b w:val="0"/>
-          <w:i w:val="0"/>
-        </w:rPr>
-        <w:t>They could. And they were.</w:t>
-      </w:r>
-    </w:p>
-    <w:p>
-      <w:r>
-        <w:rPr>
-          <w:b w:val="0"/>
-          <w:i w:val="0"/>
-        </w:rPr>
-        <w:t>All eighteen calls came from one phone number, but I used twelve different patient names. Their system remembers who owns a phone number. So ten of my twelve patients looked like strangers ringing from someone else's phone and claiming to be someone new — of course it couldn't find their records. I had built a test that was guaranteed to fail, and then written it up as their bug.</w:t>
-      </w:r>
-    </w:p>
-    <w:p>
-      <w:r>
-        <w:rPr>
-          <w:b w:val="0"/>
-          <w:i w:val="0"/>
-        </w:rPr>
-        <w:t>So I re-ran six calls using the one name their system actually had on file. That's what uncovered the real problem: even with the correct name and every detail right, the long route still died. It was never about the name. It's the route.</w:t>
-      </w:r>
-    </w:p>
-    <w:p>
-      <w:r>
-        <w:rPr>
-          <w:b w:val="0"/>
-          <w:i w:val="0"/>
-        </w:rPr>
-        <w:t>The confound was hiding a better bug than the one it caused.</w:t>
-      </w:r>
-    </w:p>
-    <w:p>
-      <w:pPr>
-        <w:pStyle w:val="Heading3"/>
-      </w:pPr>
-      <w:r>
-        <w:t>The habit, in one sentence</w:t>
-      </w:r>
-    </w:p>
-    <w:p>
-      <w:r>
-        <w:rPr>
-          <w:b w:val="0"/>
-          <w:i w:val="0"/>
-        </w:rPr>
-        <w:t>Every time I went wrong, it was because I trusted how something was worded — first Twilio's error message, then my own conclusion. Every time I got it right, it was because I made something show me what it was actually doing.</w:t>
-      </w:r>
-    </w:p>
-    <w:p>
-      <w:pPr>
-        <w:spacing w:before="40" w:after="160"/>
-        <w:pBdr>
-          <w:bottom w:val="single" w:sz="6" w:space="6" w:color="D8D8D8"/>
-        </w:pBdr>
-      </w:pPr>
-    </w:p>
-    <w:p>
-      <w:pPr>
-        <w:pStyle w:val="Heading2"/>
-      </w:pPr>
-      <w:r>
-        <w:t>If you want to demo the bug live on camera</w:t>
-      </w:r>
-    </w:p>
-    <w:p>
-      <w:r>
-        <w:rPr>
-          <w:b w:val="0"/>
-          <w:i w:val="0"/>
-        </w:rPr>
-        <w:t>It costs nothing and takes twenty seconds — no phone call needed.</w:t>
-      </w:r>
-    </w:p>
-    <w:p>
-      <w:r>
-        <w:rPr>
-          <w:b w:val="0"/>
-          <w:i w:val="0"/>
-        </w:rPr>
-        <w:t xml:space="preserve">In </w:t>
-      </w:r>
-      <w:r>
-        <w:rPr>
-          <w:b w:val="0"/>
-          <w:i w:val="0"/>
-        </w:rPr>
-        <w:t>tests/loopback.py</w:t>
-      </w:r>
-      <w:r>
-        <w:rPr>
-          <w:b w:val="0"/>
-          <w:i w:val="0"/>
-        </w:rPr>
-        <w:t xml:space="preserve">, delete the </w:t>
-      </w:r>
-      <w:r>
-        <w:rPr>
-          <w:b w:val="0"/>
-          <w:i w:val="0"/>
-        </w:rPr>
-        <w:t>customParameters</w:t>
-      </w:r>
-      <w:r>
-        <w:rPr>
-          <w:b w:val="0"/>
-          <w:i w:val="0"/>
-        </w:rPr>
-        <w:t xml:space="preserve"> block from the start frame, then run:</w:t>
-      </w:r>
-    </w:p>
-    <w:p>
-      <w:pPr>
-        <w:spacing w:before="100" w:after="140"/>
-        <w:ind w:left="202"/>
-        <w:shd w:val="clear" w:fill="F4F4F4"/>
-      </w:pPr>
-      <w:r>
-        <w:rPr>
-          <w:rFonts w:ascii="Menlo" w:hAnsi="Menlo"/>
-          <w:color w:val="1A1A1A"/>
-          <w:sz w:val="18"/>
-        </w:rPr>
-        <w:t>python tests/loopback.py refill</w:t>
-      </w:r>
-    </w:p>
-    <w:p>
-      <w:r>
-        <w:rPr>
-          <w:b w:val="0"/>
-          <w:i w:val="0"/>
-        </w:rPr>
-        <w:t xml:space="preserve">The program prints </w:t>
-      </w:r>
-      <w:r>
-        <w:rPr>
-          <w:b w:val="0"/>
-          <w:i w:val="0"/>
-        </w:rPr>
-        <w:t>refusing stream: unknown scenario ''</w:t>
-      </w:r>
-      <w:r>
-        <w:rPr>
-          <w:b w:val="0"/>
-          <w:i w:val="0"/>
-        </w:rPr>
-        <w:t xml:space="preserve"> and drops the connection — the same failure Twilio hit. Put the block back afterwards.</w:t>
+        <w:t>The part I'd actually want to see if I were hiring is what came next. My own test rig had the same mistake in it — it attached the information the same wrong way, so it agreed with me instead of testing me, which is why it passed while the real thing failed. I fixed it to behave exactly like the phone company and added a check that fails if anyone goes back to the old way. Then I pointed the same question at my own conclusions. I'd already finished the bug report — eight problems, two critical — so I asked whether my critical findings could just be artifacts of how I'd set up the test. They were. All eighteen calls came from one phone number but I'd used twelve different patient names, and their system remembers who owns a number, so ten of my patients looked like strangers ringing from someone else's phone. I'd built a test guaranteed to fail and written it up as their bug. So I re-ran six calls using the one name their system actually had on file, and that's what uncovered the real problem: even with every detail correct, the long route still died. It was never about the name. Every time I went wrong I'd trusted how something was worded — first Twilio's error, then my own conclusion — and every time I got it right I'd made something show me what it was actually doing.</w:t>
       </w:r>
     </w:p>
     <w:sectPr>

</xml_diff>

<commit_message>
Halve the plain-English paragraphs
Two paragraphs per video was right, but at ~200 and ~244 words they read as walls
of text rather than something you can say. Now roughly 110 words each.

Co-Authored-By: Claude Opus 5 (1M context) <noreply@anthropic.com>
</commit_message>
<xml_diff>
--- a/LOOM-SCRIPTS-PLAIN.docx
+++ b/LOOM-SCRIPTS-PLAIN.docx
@@ -8,15 +8,6 @@
       </w:pPr>
       <w:r>
         <w:t>Both Loom videos, in plain English</w:t>
-      </w:r>
-    </w:p>
-    <w:p>
-      <w:r>
-        <w:rPr>
-          <w:b w:val="0"/>
-          <w:i w:val="0"/>
-        </w:rPr>
-        <w:t>Two paragraphs each. Say them in your own words.</w:t>
       </w:r>
     </w:p>
     <w:p>
@@ -33,7 +24,7 @@
           <w:b w:val="0"/>
           <w:i w:val="0"/>
         </w:rPr>
-        <w:t>I built a fake patient that phones your AI receptionist and holds real conversations with it. Twelve different patients, each calling about something different — booking an appointment, a prescription refill, someone who can't say what's wrong. Think of me as a switchboard operator sitting in the middle. Twilio is the phone company: I tell it to dial your number, and when your AI picks up, instead of connecting a human it pipes the live audio to my computer. My computer hands that audio straight to OpenAI, which does the talking as the patient, then hands OpenAI's voice back down the line to you. The lucky part is the phone company and OpenAI happen to use the same audio format, so I never convert anything — I just copy the sound across untouched. That's why there's so little code.</w:t>
+        <w:t>I built a fake patient that phones your AI receptionist and holds real conversations with it — twelve of them, each calling about something different. Think of me as a switchboard operator in the middle. Twilio is the phone company: it dials your number, and when your AI answers it pipes the live audio to my computer instead of to a human. My computer passes that audio to OpenAI, which does the talking as the patient, then passes its voice back down the line. Both ends happen to use the same audio format, so I never convert anything — I just copy the sound across. That's why there's so little code.</w:t>
       </w:r>
     </w:p>
     <w:p>
@@ -42,7 +33,14 @@
           <w:b w:val="0"/>
           <w:i w:val="0"/>
         </w:rPr>
-        <w:t>I could have chained three separate tools together instead — one to turn speech into text, one to think, one to turn text back into speech — but that's like translating through three people standing in a line, and every handoff adds a delay. Your AI is already slow to answer, and two slow things talking means long awkward pauses, which is exactly what you mark people down for. I also skipped the ready-made frameworks, because the plumbing is the interesting part and a framework hides it. What I found: your AI has two ways of checking who's calling. The short way recognises the phone number, asks a date of birth, and works — people got appointments booked and moved. The long way asks for a name, a spelling, then a phone number, and every single time it goes that route the call dies: it confirms all your details out loud, says "I can't proceed further," and transfers you to a line that immediately says goodbye. Twelve of eighteen calls went the long way and not one got what they called for. Same caller, same details — the only difference was the route.</w:t>
+        <w:t xml:space="preserve">I could have chained three tools together instead — speech to text, then thinking, then text back to speech — but that's translating through three people in a line, and every handoff adds delay. Your AI is already slow, and two slow things talking means awkward pauses, which is what you mark people down for. What I found: your AI has two ways of checking who's calling. The short way works — people got appointments booked. The long way asks for a name, a spelling, then a phone number, and every time it goes that route the call dies. Twelve of eighteen calls went the long way. </w:t>
+      </w:r>
+      <w:r>
+        <w:rPr>
+          <w:b/>
+          <w:i w:val="0"/>
+        </w:rPr>
+        <w:t>Not one got what they called for.</w:t>
       </w:r>
     </w:p>
     <w:p>
@@ -59,7 +57,7 @@
           <w:b w:val="0"/>
           <w:i w:val="0"/>
         </w:rPr>
-        <w:t>My first real phone call lasted one second, and my program didn't write down a thing. So instead of guessing I asked for the actual error, and it said Twilio connected to my server and then my server hung up — which blamed my code. I didn't accept that. I asked it to connect to my server the same way Twilio does and tell me whether it actually worked, and it worked fine. So the message was technically true but pointing at the wrong thing: my server did hang up, deliberately, and nothing was recording why. I'd been theorising about three different causes and couldn't prove any of them, so I stopped guessing and said: my program can reject a call in three places and all three are silent, make each one say why. One line of logging, and the next call told me immediately — it never knew which patient to play, because I'd attached that information to the end of the web address like a link with a question mark in it, and Twilio throws that part away.</w:t>
+        <w:t>My first real call lasted one second and my program logged nothing. Rather than guess, I asked for the actual error — it said Twilio connected to my server and my server hung up, blaming my code. I didn't accept that, so I had it connect the same way Twilio does and check. Worked fine. The error was true but pointing at the wrong thing. So I stopped theorising and said: my program can reject a call in three places and all three are silent — make each one say why. One line of logging, and the next call told me instantly.</w:t>
       </w:r>
     </w:p>
     <w:p>
@@ -68,7 +66,7 @@
           <w:b w:val="0"/>
           <w:i w:val="0"/>
         </w:rPr>
-        <w:t>The part I'd actually want to see if I were hiring is what came next. My own test rig had the same mistake in it — it attached the information the same wrong way, so it agreed with me instead of testing me, which is why it passed while the real thing failed. I fixed it to behave exactly like the phone company and added a check that fails if anyone goes back to the old way. Then I pointed the same question at my own conclusions. I'd already finished the bug report — eight problems, two critical — so I asked whether my critical findings could just be artifacts of how I'd set up the test. They were. All eighteen calls came from one phone number but I'd used twelve different patient names, and their system remembers who owns a number, so ten of my patients looked like strangers ringing from someone else's phone. I'd built a test guaranteed to fail and written it up as their bug. So I re-ran six calls using the one name their system actually had on file, and that's what uncovered the real problem: even with every detail correct, the long route still died. It was never about the name. Every time I went wrong I'd trusted how something was worded — first Twilio's error, then my own conclusion — and every time I got it right I'd made something show me what it was actually doing.</w:t>
+        <w:t>Then the part I'd want to see if I were hiring. My own test rig had the same mistake, so it agreed with me instead of testing me — that's why it passed while the real thing failed. I fixed it and added a check so nobody repeats it. Then I asked the same question about my own bug report: could my critical findings just be artifacts of how I set up the test? They were. I re-ran six calls properly, and that uncovered the real bug. Every time I went wrong I'd trusted how something was worded — first Twilio's error, then my own conclusion.</w:t>
       </w:r>
     </w:p>
     <w:sectPr>

</xml_diff>

<commit_message>
Name the tools in the plain-English script
Same two paragraphs per video, with the stack called out by name: Python,
Twilio Media Streams, FastAPI, cloudflared, OpenAI Realtime gpt-realtime-2.1,
G.711 u-law, Whisper, GPT-4o, pytest, and the alternatives that were rejected
(Deepgram/ElevenLabs, Pipecat, Vapi, Retell). Video 2 names Claude Code.

Co-Authored-By: Claude Opus 5 (1M context) <noreply@anthropic.com>
</commit_message>
<xml_diff>
--- a/LOOM-SCRIPTS-PLAIN.docx
+++ b/LOOM-SCRIPTS-PLAIN.docx
@@ -24,7 +24,91 @@
           <w:b w:val="0"/>
           <w:i w:val="0"/>
         </w:rPr>
-        <w:t>I built a fake patient that phones your AI receptionist and holds real conversations with it — twelve of them, each calling about something different. Think of me as a switchboard operator in the middle. Twilio is the phone company: it dials your number, and when your AI answers it pipes the live audio to my computer instead of to a human. My computer passes that audio to OpenAI, which does the talking as the patient, then passes its voice back down the line. Both ends happen to use the same audio format, so I never convert anything — I just copy the sound across. That's why there's so little code.</w:t>
+        <w:t xml:space="preserve">It's all Python. I built a fake patient that phones your AI receptionist and holds real conversations with it — twelve of them, each calling about something different. Think of me as a switchboard operator in the middle. </w:t>
+      </w:r>
+      <w:r>
+        <w:rPr>
+          <w:b/>
+          <w:i w:val="0"/>
+        </w:rPr>
+        <w:t>Twilio</w:t>
+      </w:r>
+      <w:r>
+        <w:rPr>
+          <w:b w:val="0"/>
+          <w:i w:val="0"/>
+        </w:rPr>
+        <w:t xml:space="preserve"> is the phone company: it dials your number, and when your AI answers, Twilio's </w:t>
+      </w:r>
+      <w:r>
+        <w:rPr>
+          <w:b/>
+          <w:i w:val="0"/>
+        </w:rPr>
+        <w:t>Media Streams</w:t>
+      </w:r>
+      <w:r>
+        <w:rPr>
+          <w:b w:val="0"/>
+          <w:i w:val="0"/>
+        </w:rPr>
+        <w:t xml:space="preserve"> pipes the live audio to a small </w:t>
+      </w:r>
+      <w:r>
+        <w:rPr>
+          <w:b/>
+          <w:i w:val="0"/>
+        </w:rPr>
+        <w:t>FastAPI</w:t>
+      </w:r>
+      <w:r>
+        <w:rPr>
+          <w:b w:val="0"/>
+          <w:i w:val="0"/>
+        </w:rPr>
+        <w:t xml:space="preserve"> server on my laptop instead of to a human. </w:t>
+      </w:r>
+      <w:r>
+        <w:rPr>
+          <w:b/>
+          <w:i w:val="0"/>
+        </w:rPr>
+        <w:t>cloudflared</w:t>
+      </w:r>
+      <w:r>
+        <w:rPr>
+          <w:b w:val="0"/>
+          <w:i w:val="0"/>
+        </w:rPr>
+        <w:t xml:space="preserve"> gives Twilio a public address to reach me at. My server passes the audio to </w:t>
+      </w:r>
+      <w:r>
+        <w:rPr>
+          <w:b/>
+          <w:i w:val="0"/>
+        </w:rPr>
+        <w:t>OpenAI's Realtime API</w:t>
+      </w:r>
+      <w:r>
+        <w:rPr>
+          <w:b w:val="0"/>
+          <w:i w:val="0"/>
+        </w:rPr>
+        <w:t xml:space="preserve"> — the </w:t>
+      </w:r>
+      <w:r>
+        <w:rPr>
+          <w:b w:val="0"/>
+          <w:i w:val="0"/>
+        </w:rPr>
+        <w:t>gpt-realtime-2.1</w:t>
+      </w:r>
+      <w:r>
+        <w:rPr>
+          <w:b w:val="0"/>
+          <w:i w:val="0"/>
+        </w:rPr>
+        <w:t xml:space="preserve"> model — which does the talking as the patient, then passes its voice back down the line. Both ends use the same audio format, G.711 μ-law, so I never convert anything. I just copy the sound across.</w:t>
       </w:r>
     </w:p>
     <w:p>
@@ -33,7 +117,133 @@
           <w:b w:val="0"/>
           <w:i w:val="0"/>
         </w:rPr>
-        <w:t xml:space="preserve">I could have chained three tools together instead — speech to text, then thinking, then text back to speech — but that's translating through three people in a line, and every handoff adds delay. Your AI is already slow, and two slow things talking means awkward pauses, which is what you mark people down for. What I found: your AI has two ways of checking who's calling. The short way works — people got appointments booked. The long way asks for a name, a spelling, then a phone number, and every time it goes that route the call dies. Twelve of eighteen calls went the long way. </w:t>
+        <w:t xml:space="preserve">I could have chained three tools instead — </w:t>
+      </w:r>
+      <w:r>
+        <w:rPr>
+          <w:b/>
+          <w:i w:val="0"/>
+        </w:rPr>
+        <w:t>Deepgram</w:t>
+      </w:r>
+      <w:r>
+        <w:rPr>
+          <w:b w:val="0"/>
+          <w:i w:val="0"/>
+        </w:rPr>
+        <w:t xml:space="preserve"> for speech to text, </w:t>
+      </w:r>
+      <w:r>
+        <w:rPr>
+          <w:b/>
+          <w:i w:val="0"/>
+        </w:rPr>
+        <w:t>GPT</w:t>
+      </w:r>
+      <w:r>
+        <w:rPr>
+          <w:b w:val="0"/>
+          <w:i w:val="0"/>
+        </w:rPr>
+        <w:t xml:space="preserve"> to think, </w:t>
+      </w:r>
+      <w:r>
+        <w:rPr>
+          <w:b/>
+          <w:i w:val="0"/>
+        </w:rPr>
+        <w:t>ElevenLabs</w:t>
+      </w:r>
+      <w:r>
+        <w:rPr>
+          <w:b w:val="0"/>
+          <w:i w:val="0"/>
+        </w:rPr>
+        <w:t xml:space="preserve"> for the voice back — but that's translating through three people in a line, and every handoff adds delay. Your AI is already slow, and two slow things talking means awkward pauses, which is what you mark people down for. I also skipped </w:t>
+      </w:r>
+      <w:r>
+        <w:rPr>
+          <w:b/>
+          <w:i w:val="0"/>
+        </w:rPr>
+        <w:t>Pipecat</w:t>
+      </w:r>
+      <w:r>
+        <w:rPr>
+          <w:b w:val="0"/>
+          <w:i w:val="0"/>
+        </w:rPr>
+        <w:t xml:space="preserve">, and </w:t>
+      </w:r>
+      <w:r>
+        <w:rPr>
+          <w:b/>
+          <w:i w:val="0"/>
+        </w:rPr>
+        <w:t>Vapi</w:t>
+      </w:r>
+      <w:r>
+        <w:rPr>
+          <w:b w:val="0"/>
+          <w:i w:val="0"/>
+        </w:rPr>
+        <w:t xml:space="preserve"> and </w:t>
+      </w:r>
+      <w:r>
+        <w:rPr>
+          <w:b/>
+          <w:i w:val="0"/>
+        </w:rPr>
+        <w:t>Retell</w:t>
+      </w:r>
+      <w:r>
+        <w:rPr>
+          <w:b w:val="0"/>
+          <w:i w:val="0"/>
+        </w:rPr>
+        <w:t xml:space="preserve">, because then the framework owns the decisions worth discussing. </w:t>
+      </w:r>
+      <w:r>
+        <w:rPr>
+          <w:b/>
+          <w:i w:val="0"/>
+        </w:rPr>
+        <w:t>Whisper</w:t>
+      </w:r>
+      <w:r>
+        <w:rPr>
+          <w:b w:val="0"/>
+          <w:i w:val="0"/>
+        </w:rPr>
+        <w:t xml:space="preserve"> transcribes your side, </w:t>
+      </w:r>
+      <w:r>
+        <w:rPr>
+          <w:b/>
+          <w:i w:val="0"/>
+        </w:rPr>
+        <w:t>Twilio</w:t>
+      </w:r>
+      <w:r>
+        <w:rPr>
+          <w:b w:val="0"/>
+          <w:i w:val="0"/>
+        </w:rPr>
+        <w:t xml:space="preserve"> records the audio, and </w:t>
+      </w:r>
+      <w:r>
+        <w:rPr>
+          <w:b/>
+          <w:i w:val="0"/>
+        </w:rPr>
+        <w:t>GPT-4o</w:t>
+      </w:r>
+      <w:r>
+        <w:rPr>
+          <w:b w:val="0"/>
+          <w:i w:val="0"/>
+        </w:rPr>
+        <w:t xml:space="preserve"> does a first pass over the transcripts. What I found: your AI has two ways of checking who's calling. The short way works. The long way asks for a name, a spelling, then a phone number — and every time it goes that route, the call dies. Twelve of eighteen went that way. </w:t>
       </w:r>
       <w:r>
         <w:rPr>
@@ -57,7 +267,35 @@
           <w:b w:val="0"/>
           <w:i w:val="0"/>
         </w:rPr>
-        <w:t>My first real call lasted one second and my program logged nothing. Rather than guess, I asked for the actual error — it said Twilio connected to my server and my server hung up, blaming my code. I didn't accept that, so I had it connect the same way Twilio does and check. Worked fine. The error was true but pointing at the wrong thing. So I stopped theorising and said: my program can reject a call in three places and all three are silent — make each one say why. One line of logging, and the next call told me instantly.</w:t>
+        <w:t xml:space="preserve">I did all of this in </w:t>
+      </w:r>
+      <w:r>
+        <w:rPr>
+          <w:b/>
+          <w:i w:val="0"/>
+        </w:rPr>
+        <w:t>Claude Code</w:t>
+      </w:r>
+      <w:r>
+        <w:rPr>
+          <w:b w:val="0"/>
+          <w:i w:val="0"/>
+        </w:rPr>
+        <w:t xml:space="preserve">. My first real call lasted one second and my program logged nothing. Rather than guess, I had it pull the actual </w:t>
+      </w:r>
+      <w:r>
+        <w:rPr>
+          <w:b/>
+          <w:i w:val="0"/>
+        </w:rPr>
+        <w:t>Twilio</w:t>
+      </w:r>
+      <w:r>
+        <w:rPr>
+          <w:b w:val="0"/>
+          <w:i w:val="0"/>
+        </w:rPr>
+        <w:t xml:space="preserve"> error — error 31921, which says Twilio connected to my server and my server hung up. So it blamed my code. I didn't accept that, so I had it connect to my server the same way Twilio does and check. Worked fine. The error was true but pointing at the wrong thing. So I stopped theorising: my program can reject a call in three places and all three are silent — make each one say why. One line of logging, and the next call told me instantly.</w:t>
       </w:r>
     </w:p>
     <w:p>
@@ -66,7 +304,21 @@
           <w:b w:val="0"/>
           <w:i w:val="0"/>
         </w:rPr>
-        <w:t>Then the part I'd want to see if I were hiring. My own test rig had the same mistake, so it agreed with me instead of testing me — that's why it passed while the real thing failed. I fixed it and added a check so nobody repeats it. Then I asked the same question about my own bug report: could my critical findings just be artifacts of how I set up the test? They were. I re-ran six calls properly, and that uncovered the real bug. Every time I went wrong I'd trusted how something was worded — first Twilio's error, then my own conclusion.</w:t>
+        <w:t xml:space="preserve">Then the part I'd want to see if I were hiring. My own test rig had the same mistake, so it agreed with me instead of testing me — that's why it passed while the real thing failed. I fixed it and added a </w:t>
+      </w:r>
+      <w:r>
+        <w:rPr>
+          <w:b/>
+          <w:i w:val="0"/>
+        </w:rPr>
+        <w:t>pytest</w:t>
+      </w:r>
+      <w:r>
+        <w:rPr>
+          <w:b w:val="0"/>
+          <w:i w:val="0"/>
+        </w:rPr>
+        <w:t xml:space="preserve"> check so nobody repeats it. Then I asked the same question about my own bug report: could my critical findings just be artifacts of how I set up the test? They were — all eighteen calls came from one number but I'd used twelve patient names. So I re-ran six calls properly, and that uncovered the real bug. Every time I went wrong I'd trusted how something was worded — first Twilio's error, then my own conclusion.</w:t>
       </w:r>
     </w:p>
     <w:sectPr>

</xml_diff>